<commit_message>
feat(haro-docx-writer): placeholder detect-confirm-fill with template-owned chrome
</commit_message>
<xml_diff>
--- a/skills/haro-docx-writer/templates/default-template.docx
+++ b/skills/haro-docx-writer/templates/default-template.docx
@@ -1149,116 +1149,6 @@
       <w:pStyle w:val="Footer"/>
     </w:pPr>
   </w:p>
-  <w:tbl>
-    <w:tblPr>
-      <w:tblW w:type="auto" w:w="0"/>
-      <w:tblLook w:firstColumn="1" w:firstRow="1" w:lastColumn="0" w:lastRow="0" w:noHBand="0" w:noVBand="1" w:val="04A0"/>
-      <w:tblBorders>
-        <w:top w:val="nil"/>
-        <w:left w:val="nil"/>
-        <w:bottom w:val="nil"/>
-        <w:right w:val="nil"/>
-        <w:insideH w:val="nil"/>
-        <w:insideV w:val="nil"/>
-      </w:tblBorders>
-    </w:tblPr>
-    <w:tblGrid>
-      <w:gridCol w:w="4680"/>
-      <w:gridCol w:w="4680"/>
-    </w:tblGrid>
-    <w:tr>
-      <w:tc>
-        <w:tcPr>
-          <w:tcW w:type="dxa" w:w="4680"/>
-        </w:tcPr>
-        <w:p>
-          <w:r>
-            <w:rPr>
-              <w:rFonts w:ascii="Times New Roman" w:hAnsi="Times New Roman" w:cs="Times New Roman"/>
-              <w:color w:val="000000"/>
-              <w:sz w:val="16"/>
-            </w:rPr>
-            <w:t xml:space="preserve">Trang </w:t>
-          </w:r>
-          <w:r>
-            <w:rPr>
-              <w:rFonts w:ascii="Times New Roman" w:hAnsi="Times New Roman" w:cs="Times New Roman"/>
-              <w:color w:val="000000"/>
-              <w:sz w:val="16"/>
-            </w:rPr>
-            <w:fldChar w:fldCharType="begin"/>
-          </w:r>
-          <w:r>
-            <w:rPr>
-              <w:rFonts w:ascii="Times New Roman" w:hAnsi="Times New Roman" w:cs="Times New Roman"/>
-              <w:color w:val="000000"/>
-              <w:sz w:val="16"/>
-            </w:rPr>
-            <w:instrText xml:space="preserve">PAGE</w:instrText>
-          </w:r>
-          <w:r>
-            <w:rPr>
-              <w:rFonts w:ascii="Times New Roman" w:hAnsi="Times New Roman" w:cs="Times New Roman"/>
-              <w:color w:val="000000"/>
-              <w:sz w:val="16"/>
-            </w:rPr>
-            <w:fldChar w:fldCharType="end"/>
-          </w:r>
-          <w:r>
-            <w:rPr>
-              <w:rFonts w:ascii="Times New Roman" w:hAnsi="Times New Roman" w:cs="Times New Roman"/>
-              <w:color w:val="000000"/>
-              <w:sz w:val="16"/>
-            </w:rPr>
-            <w:t xml:space="preserve"> / </w:t>
-          </w:r>
-          <w:r>
-            <w:rPr>
-              <w:rFonts w:ascii="Times New Roman" w:hAnsi="Times New Roman" w:cs="Times New Roman"/>
-              <w:color w:val="000000"/>
-              <w:sz w:val="16"/>
-            </w:rPr>
-            <w:fldChar w:fldCharType="begin"/>
-          </w:r>
-          <w:r>
-            <w:rPr>
-              <w:rFonts w:ascii="Times New Roman" w:hAnsi="Times New Roman" w:cs="Times New Roman"/>
-              <w:color w:val="000000"/>
-              <w:sz w:val="16"/>
-            </w:rPr>
-            <w:instrText xml:space="preserve">NUMPAGES</w:instrText>
-          </w:r>
-          <w:r>
-            <w:rPr>
-              <w:rFonts w:ascii="Times New Roman" w:hAnsi="Times New Roman" w:cs="Times New Roman"/>
-              <w:color w:val="000000"/>
-              <w:sz w:val="16"/>
-            </w:rPr>
-            <w:fldChar w:fldCharType="end"/>
-          </w:r>
-        </w:p>
-      </w:tc>
-      <w:tc>
-        <w:tcPr>
-          <w:tcW w:type="dxa" w:w="4680"/>
-        </w:tcPr>
-        <w:p>
-          <w:pPr>
-            <w:jc w:val="right"/>
-          </w:pPr>
-          <w:r>
-            <w:rPr>
-              <w:rFonts w:ascii="Times New Roman" w:hAnsi="Times New Roman" w:cs="Times New Roman"/>
-              <w:i/>
-              <w:color w:val="000000"/>
-              <w:sz w:val="16"/>
-            </w:rPr>
-            <w:t>Giải pháp Quản lý Dự án HARO</w:t>
-          </w:r>
-        </w:p>
-      </w:tc>
-    </w:tr>
-  </w:tbl>
 </w:ftr>
 </file>
 
@@ -1279,66 +1169,6 @@
       <w:pStyle w:val="Header"/>
     </w:pPr>
   </w:p>
-  <w:tbl>
-    <w:tblPr>
-      <w:tblW w:type="auto" w:w="0"/>
-      <w:tblLook w:firstColumn="1" w:firstRow="1" w:lastColumn="0" w:lastRow="0" w:noHBand="0" w:noVBand="1" w:val="04A0"/>
-      <w:tblBorders>
-        <w:top w:val="nil"/>
-        <w:left w:val="nil"/>
-        <w:bottom w:val="nil"/>
-        <w:right w:val="nil"/>
-        <w:insideH w:val="nil"/>
-        <w:insideV w:val="nil"/>
-      </w:tblBorders>
-    </w:tblPr>
-    <w:tblGrid>
-      <w:gridCol w:w="4680"/>
-      <w:gridCol w:w="4680"/>
-    </w:tblGrid>
-    <w:tr>
-      <w:tc>
-        <w:tcPr>
-          <w:tcW w:type="dxa" w:w="4680"/>
-        </w:tcPr>
-        <w:p/>
-      </w:tc>
-      <w:tc>
-        <w:tcPr>
-          <w:tcW w:type="dxa" w:w="4680"/>
-        </w:tcPr>
-        <w:p>
-          <w:pPr>
-            <w:jc w:val="right"/>
-          </w:pPr>
-          <w:r>
-            <w:rPr>
-              <w:rFonts w:ascii="Times New Roman" w:hAnsi="Times New Roman" w:cs="Times New Roman"/>
-              <w:b/>
-              <w:color w:val="000000"/>
-              <w:sz w:val="18"/>
-            </w:rPr>
-            <w:t>Tài liệu Đặc tả Yêu cầu Kỹ thuật (SAD)</w:t>
-          </w:r>
-          <w:r>
-            <w:rPr>
-              <w:rFonts w:ascii="Times New Roman" w:hAnsi="Times New Roman" w:cs="Times New Roman"/>
-              <w:color w:val="000000"/>
-            </w:rPr>
-            <w:br/>
-          </w:r>
-          <w:r>
-            <w:rPr>
-              <w:rFonts w:ascii="Times New Roman" w:hAnsi="Times New Roman" w:cs="Times New Roman"/>
-              <w:color w:val="000000"/>
-              <w:sz w:val="16"/>
-            </w:rPr>
-            <w:t>CÔNG TY TNHH MẪU VIỆT NAM</w:t>
-          </w:r>
-        </w:p>
-      </w:tc>
-    </w:tr>
-  </w:tbl>
 </w:hdr>
 </file>
 

</xml_diff>